<commit_message>
Update Team work agreement
</commit_message>
<xml_diff>
--- a/Doumentation/Team Agremment/Team-Working-Agreement.docx
+++ b/Doumentation/Team Agremment/Team-Working-Agreement.docx
@@ -598,8 +598,6 @@
           <w:bottom w:val="single" w:sz="6" w:space="4" w:color="1F3B73"/>
         </w:pBdr>
         <w:spacing w:before="300" w:after="150"/>
-      </w:pPr>
-      <w:r>
         <w:rPr>
           <w:b/>
           <w:bCs/>
@@ -607,7 +605,16 @@
           <w:sz w:val="28"/>
           <w:szCs w:val="28"/>
         </w:rPr>
-        <w:t>Team Principles</w:t>
+      </w:pPr>
+      <w:r>
+        <w:rPr>
+          <w:b/>
+          <w:bCs/>
+          <w:color w:val="1F3B73"/>
+          <w:sz w:val="28"/>
+          <w:szCs w:val="28"/>
+        </w:rPr>
+        <w:t>1. Communication &amp; Collaboration</w:t>
       </w:r>
     </w:p>
     <w:p>
@@ -620,7 +627,14 @@
         <w:spacing w:after="80"/>
       </w:pPr>
       <w:r>
-        <w:t>Respectful, timely, and transparent communication</w:t>
+        <w:rPr>
+          <w:b/>
+          <w:bCs/>
+        </w:rPr>
+        <w:t>Communication Channels:</w:t>
+      </w:r>
+      <w:r>
+        <w:t xml:space="preserve"> Use Zoom for meetings and technical discussions, WhatsApp for quick updates, GitHub for code, and GitHub Wiki for documentation.</w:t>
       </w:r>
     </w:p>
     <w:p>
@@ -633,7 +647,14 @@
         <w:spacing w:after="80"/>
       </w:pPr>
       <w:r>
-        <w:t>Clear ownership with cross-component collaboration</w:t>
+        <w:rPr>
+          <w:b/>
+          <w:bCs/>
+        </w:rPr>
+        <w:t>Respect</w:t>
+      </w:r>
+      <w:r>
+        <w:t>: Respect everyone's opinions. Discuss major changes with the team before making them.</w:t>
       </w:r>
     </w:p>
     <w:p>
@@ -646,7 +667,40 @@
         <w:spacing w:after="80"/>
       </w:pPr>
       <w:r>
-        <w:t>Balanced workload and early escalation of blockers</w:t>
+        <w:rPr>
+          <w:b/>
+          <w:bCs/>
+        </w:rPr>
+        <w:t>Conflict Resolution:</w:t>
+      </w:r>
+      <w:r>
+        <w:t xml:space="preserve"> Discuss different solutions, share research, and vote to make the final decision.</w:t>
+      </w:r>
+    </w:p>
+    <w:p>
+      <w:pPr>
+        <w:pStyle w:val="Heading1"/>
+        <w:pBdr>
+          <w:bottom w:val="single" w:sz="6" w:space="4" w:color="1F3B73"/>
+        </w:pBdr>
+        <w:spacing w:before="300" w:after="150"/>
+        <w:rPr>
+          <w:b/>
+          <w:bCs/>
+          <w:color w:val="1F3B73"/>
+          <w:sz w:val="28"/>
+          <w:szCs w:val="28"/>
+        </w:rPr>
+      </w:pPr>
+      <w:r>
+        <w:rPr>
+          <w:b/>
+          <w:bCs/>
+          <w:color w:val="1F3B73"/>
+          <w:sz w:val="28"/>
+          <w:szCs w:val="28"/>
+        </w:rPr>
+        <w:t>2. Meeting Schedule</w:t>
       </w:r>
     </w:p>
     <w:p>
@@ -659,15 +713,14 @@
         <w:spacing w:after="80"/>
       </w:pPr>
       <w:r>
-        <w:t xml:space="preserve">Use GitHub issues, </w:t>
-      </w:r>
-      <w:proofErr w:type="gramStart"/>
-      <w:r>
-        <w:t>branches</w:t>
-      </w:r>
-      <w:proofErr w:type="gramEnd"/>
-      <w:r>
-        <w:t>, and pull requests</w:t>
+        <w:rPr>
+          <w:b/>
+          <w:bCs/>
+        </w:rPr>
+        <w:t>Meetings</w:t>
+      </w:r>
+      <w:r>
+        <w:t>: Meet twice a week.</w:t>
       </w:r>
     </w:p>
     <w:p>
@@ -680,7 +733,14 @@
         <w:spacing w:after="80"/>
       </w:pPr>
       <w:r>
-        <w:t>Attend Scrum ceremonies and give honest status updates</w:t>
+        <w:rPr>
+          <w:b/>
+          <w:bCs/>
+        </w:rPr>
+        <w:t>Agenda</w:t>
+      </w:r>
+      <w:r>
+        <w:t>: Prepare an agenda before each meeting.</w:t>
       </w:r>
     </w:p>
     <w:p>
@@ -693,7 +753,14 @@
         <w:spacing w:after="80"/>
       </w:pPr>
       <w:r>
-        <w:t>Document technical decisions and important changes</w:t>
+        <w:rPr>
+          <w:b/>
+          <w:bCs/>
+        </w:rPr>
+        <w:t>Absences</w:t>
+      </w:r>
+      <w:r>
+        <w:t>: Inform the team in advance. Meetings may be recorded for absent members.</w:t>
       </w:r>
     </w:p>
     <w:p>
@@ -706,8 +773,229 @@
         <w:spacing w:after="80"/>
       </w:pPr>
       <w:r>
-        <w:t>Integrate frequently rather than waiting until sprint end</w:t>
-      </w:r>
+        <w:rPr>
+          <w:b/>
+          <w:bCs/>
+        </w:rPr>
+        <w:t>Sprints</w:t>
+      </w:r>
+      <w:r>
+        <w:t>: Plan the next sprint after the current one ends. Hold a retrospective meeting at the end of each sprint.</w:t>
+      </w:r>
+    </w:p>
+    <w:p>
+      <w:pPr>
+        <w:pStyle w:val="Heading1"/>
+        <w:pBdr>
+          <w:bottom w:val="single" w:sz="6" w:space="4" w:color="1F3B73"/>
+        </w:pBdr>
+        <w:spacing w:before="300" w:after="150"/>
+        <w:rPr>
+          <w:b/>
+          <w:bCs/>
+          <w:color w:val="1F3B73"/>
+          <w:sz w:val="28"/>
+          <w:szCs w:val="28"/>
+        </w:rPr>
+      </w:pPr>
+      <w:r>
+        <w:rPr>
+          <w:b/>
+          <w:bCs/>
+          <w:color w:val="1F3B73"/>
+          <w:sz w:val="28"/>
+          <w:szCs w:val="28"/>
+        </w:rPr>
+        <w:t>3. Teamwork &amp; Responsibilities</w:t>
+      </w:r>
+    </w:p>
+    <w:p>
+      <w:pPr>
+        <w:pStyle w:val="ListParagraph"/>
+        <w:numPr>
+          <w:ilvl w:val="0"/>
+          <w:numId w:val="1"/>
+        </w:numPr>
+        <w:spacing w:after="80"/>
+      </w:pPr>
+      <w:r>
+        <w:rPr>
+          <w:b/>
+          <w:bCs/>
+        </w:rPr>
+        <w:t>Workload</w:t>
+      </w:r>
+      <w:r>
+        <w:t>: Divide tasks fairly and break large tasks into smaller parts.</w:t>
+      </w:r>
+    </w:p>
+    <w:p>
+      <w:pPr>
+        <w:pStyle w:val="ListParagraph"/>
+        <w:numPr>
+          <w:ilvl w:val="0"/>
+          <w:numId w:val="1"/>
+        </w:numPr>
+        <w:spacing w:after="80"/>
+      </w:pPr>
+      <w:r>
+        <w:rPr>
+          <w:b/>
+          <w:bCs/>
+        </w:rPr>
+        <w:t>Blockers</w:t>
+      </w:r>
+      <w:r>
+        <w:t>: Try to solve problems independently and share what you have tried before asking for help.</w:t>
+      </w:r>
+    </w:p>
+    <w:p>
+      <w:pPr>
+        <w:pStyle w:val="ListParagraph"/>
+        <w:numPr>
+          <w:ilvl w:val="0"/>
+          <w:numId w:val="1"/>
+        </w:numPr>
+        <w:spacing w:after="80"/>
+      </w:pPr>
+      <w:r>
+        <w:rPr>
+          <w:b/>
+          <w:bCs/>
+        </w:rPr>
+        <w:t>Accountability</w:t>
+      </w:r>
+      <w:r>
+        <w:t>: Update Jira regularly and link tasks to GitHub commits or documents.</w:t>
+      </w:r>
+    </w:p>
+    <w:p>
+      <w:pPr>
+        <w:pStyle w:val="ListParagraph"/>
+        <w:numPr>
+          <w:ilvl w:val="0"/>
+          <w:numId w:val="1"/>
+        </w:numPr>
+        <w:spacing w:after="80"/>
+      </w:pPr>
+      <w:r>
+        <w:rPr>
+          <w:b/>
+          <w:bCs/>
+        </w:rPr>
+        <w:t>Respect</w:t>
+      </w:r>
+      <w:r>
+        <w:t>: Communicate politely and support one another.</w:t>
+      </w:r>
+    </w:p>
+    <w:p>
+      <w:pPr>
+        <w:pStyle w:val="Heading1"/>
+        <w:pBdr>
+          <w:bottom w:val="single" w:sz="6" w:space="4" w:color="1F3B73"/>
+        </w:pBdr>
+        <w:spacing w:before="300" w:after="150"/>
+        <w:rPr>
+          <w:b/>
+          <w:bCs/>
+          <w:color w:val="1F3B73"/>
+          <w:sz w:val="28"/>
+          <w:szCs w:val="28"/>
+        </w:rPr>
+      </w:pPr>
+      <w:r>
+        <w:rPr>
+          <w:b/>
+          <w:bCs/>
+          <w:color w:val="1F3B73"/>
+          <w:sz w:val="28"/>
+          <w:szCs w:val="28"/>
+        </w:rPr>
+        <w:t>4. GitHub Workflow</w:t>
+      </w:r>
+    </w:p>
+    <w:p>
+      <w:pPr>
+        <w:pStyle w:val="ListParagraph"/>
+        <w:numPr>
+          <w:ilvl w:val="0"/>
+          <w:numId w:val="1"/>
+        </w:numPr>
+        <w:spacing w:after="80"/>
+      </w:pPr>
+      <w:r>
+        <w:rPr>
+          <w:b/>
+          <w:bCs/>
+        </w:rPr>
+        <w:t>Code Updates</w:t>
+      </w:r>
+      <w:r>
+        <w:t>: Inform the team on WhatsApp before or after pushing code.</w:t>
+      </w:r>
+    </w:p>
+    <w:p>
+      <w:pPr>
+        <w:spacing w:after="80"/>
+      </w:pPr>
+    </w:p>
+    <w:p>
+      <w:pPr>
+        <w:pStyle w:val="ListParagraph"/>
+        <w:numPr>
+          <w:ilvl w:val="0"/>
+          <w:numId w:val="1"/>
+        </w:numPr>
+        <w:spacing w:after="80"/>
+      </w:pPr>
+      <w:r>
+        <w:rPr>
+          <w:b/>
+          <w:bCs/>
+        </w:rPr>
+        <w:lastRenderedPageBreak/>
+        <w:t>Conflicts</w:t>
+      </w:r>
+      <w:r>
+        <w:t>: Discuss changes that affect other team members' code before resolving them.</w:t>
+      </w:r>
+    </w:p>
+    <w:p>
+      <w:pPr>
+        <w:pStyle w:val="ListParagraph"/>
+        <w:numPr>
+          <w:ilvl w:val="0"/>
+          <w:numId w:val="1"/>
+        </w:numPr>
+        <w:spacing w:after="80"/>
+      </w:pPr>
+      <w:r>
+        <w:rPr>
+          <w:b/>
+          <w:bCs/>
+        </w:rPr>
+        <w:t>Branches &amp; Pull Requests</w:t>
+      </w:r>
+      <w:r>
+        <w:t>: Do not push directly to the main branch. Use feature branches and pull requests, with at least one team member reviewing and approving the changes.</w:t>
+      </w:r>
+    </w:p>
+    <w:p>
+      <w:pPr>
+        <w:pStyle w:val="Heading1"/>
+        <w:pBdr>
+          <w:bottom w:val="single" w:sz="6" w:space="4" w:color="1F3B73"/>
+        </w:pBdr>
+        <w:spacing w:before="300" w:after="150"/>
+        <w:rPr>
+          <w:b/>
+          <w:bCs/>
+          <w:color w:val="1F3B73"/>
+          <w:sz w:val="28"/>
+          <w:szCs w:val="28"/>
+        </w:rPr>
+      </w:pPr>
     </w:p>
     <w:p>
       <w:pPr>
@@ -836,83 +1124,6 @@
       <w:pPr>
         <w:spacing w:after="80"/>
       </w:pPr>
-    </w:p>
-    <w:p>
-      <w:pPr>
-        <w:spacing w:after="80"/>
-      </w:pPr>
-    </w:p>
-    <w:p>
-      <w:pPr>
-        <w:pStyle w:val="Heading1"/>
-        <w:pBdr>
-          <w:bottom w:val="single" w:sz="6" w:space="4" w:color="1F3B73"/>
-        </w:pBdr>
-        <w:spacing w:before="300" w:after="150"/>
-      </w:pPr>
-      <w:r>
-        <w:rPr>
-          <w:b/>
-          <w:bCs/>
-          <w:color w:val="1F3B73"/>
-          <w:sz w:val="28"/>
-          <w:szCs w:val="28"/>
-        </w:rPr>
-        <w:lastRenderedPageBreak/>
-        <w:t>Communication &amp; Meeting Norms</w:t>
-      </w:r>
-    </w:p>
-    <w:p>
-      <w:pPr>
-        <w:pStyle w:val="ListParagraph"/>
-        <w:numPr>
-          <w:ilvl w:val="0"/>
-          <w:numId w:val="1"/>
-        </w:numPr>
-        <w:spacing w:after="80"/>
-      </w:pPr>
-      <w:r>
-        <w:t>Daily async stand-up updates posted in the team channel</w:t>
-      </w:r>
-    </w:p>
-    <w:p>
-      <w:pPr>
-        <w:pStyle w:val="ListParagraph"/>
-        <w:numPr>
-          <w:ilvl w:val="0"/>
-          <w:numId w:val="1"/>
-        </w:numPr>
-        <w:spacing w:after="80"/>
-      </w:pPr>
-      <w:r>
-        <w:t>Weekly sprint planning and review meetings</w:t>
-      </w:r>
-    </w:p>
-    <w:p>
-      <w:pPr>
-        <w:pStyle w:val="ListParagraph"/>
-        <w:numPr>
-          <w:ilvl w:val="0"/>
-          <w:numId w:val="1"/>
-        </w:numPr>
-        <w:spacing w:after="80"/>
-      </w:pPr>
-      <w:r>
-        <w:t>Blockers escalated to the Scrum Master within 24 hours</w:t>
-      </w:r>
-    </w:p>
-    <w:p>
-      <w:pPr>
-        <w:pStyle w:val="ListParagraph"/>
-        <w:numPr>
-          <w:ilvl w:val="0"/>
-          <w:numId w:val="1"/>
-        </w:numPr>
-        <w:spacing w:after="80"/>
-      </w:pPr>
-      <w:r>
-        <w:t>All decisions affecting scope documented in the wiki or backlog</w:t>
-      </w:r>
     </w:p>
     <w:sectPr>
       <w:headerReference w:type="default" r:id="rId8"/>
@@ -1029,6 +1240,7 @@
           <w:dataBinding w:prefixMappings="xmlns:ns0='http://purl.org/dc/elements/1.1/' xmlns:ns1='http://schemas.openxmlformats.org/package/2006/metadata/core-properties' " w:xpath="/ns1:coreProperties[1]/ns0:creator[1]" w:storeItemID="{6C3C8BC8-F283-45AE-878A-BAB7291924A1}"/>
           <w:text/>
         </w:sdtPr>
+        <w:sdtEndPr/>
         <w:sdtContent>
           <w:tc>
             <w:tcPr>
@@ -1264,6 +1476,602 @@
 <file path=word/numbering.xml><?xml version="1.0" encoding="utf-8"?>
 <w:numbering xmlns:wpc="http://schemas.microsoft.com/office/word/2010/wordprocessingCanvas" xmlns:cx="http://schemas.microsoft.com/office/drawing/2014/chartex" xmlns:cx1="http://schemas.microsoft.com/office/drawing/2015/9/8/chartex" xmlns:cx2="http://schemas.microsoft.com/office/drawing/2015/10/21/chartex" xmlns:cx3="http://schemas.microsoft.com/office/drawing/2016/5/9/chartex" xmlns:cx4="http://schemas.microsoft.com/office/drawing/2016/5/10/chartex" xmlns:cx5="http://schemas.microsoft.com/office/drawing/2016/5/11/chartex" xmlns:cx6="http://schemas.microsoft.com/office/drawing/2016/5/12/chartex" xmlns:cx7="http://schemas.microsoft.com/office/drawing/2016/5/13/chartex" xmlns:cx8="http://schemas.microsoft.com/office/drawing/2016/5/14/chartex" xmlns:mc="http://schemas.openxmlformats.org/markup-compatibility/2006" xmlns:aink="http://schemas.microsoft.com/office/drawing/2016/ink" xmlns:am3d="http://schemas.microsoft.com/office/drawing/2017/model3d" xmlns:o="urn:schemas-microsoft-com:office:office" xmlns:oel="http://schemas.microsoft.com/office/2019/extlst" xmlns:r="http://schemas.openxmlformats.org/officeDocument/2006/relationships" xmlns:m="http://schemas.openxmlformats.org/officeDocument/2006/math" xmlns:v="urn:schemas-microsoft-com:vml" xmlns:wp14="http://schemas.microsoft.com/office/word/2010/wordprocessingDrawing" xmlns:wp="http://schemas.openxmlformats.org/drawingml/2006/wordprocessingDrawing" xmlns:w10="urn:schemas-microsoft-com:office:word" xmlns:w="http://schemas.openxmlformats.org/wordprocessingml/2006/main" xmlns:w14="http://schemas.microsoft.com/office/word/2010/wordml" xmlns:w15="http://schemas.microsoft.com/office/word/2012/wordml" xmlns:w16cex="http://schemas.microsoft.com/office/word/2018/wordml/cex" xmlns:w16cid="http://schemas.microsoft.com/office/word/2016/wordml/cid" xmlns:w16="http://schemas.microsoft.com/office/word/2018/wordml" xmlns:w16du="http://schemas.microsoft.com/office/word/2023/wordml/word16du" xmlns:w16sdtdh="http://schemas.microsoft.com/office/word/2020/wordml/sdtdatahash" xmlns:w16sdtfl="http://schemas.microsoft.com/office/word/2024/wordml/sdtformatlock" xmlns:w16se="http://schemas.microsoft.com/office/word/2015/wordml/symex" xmlns:wpg="http://schemas.microsoft.com/office/word/2010/wordprocessingGroup" xmlns:wpi="http://schemas.microsoft.com/office/word/2010/wordprocessingInk" xmlns:wne="http://schemas.microsoft.com/office/word/2006/wordml" xmlns:wps="http://schemas.microsoft.com/office/word/2010/wordprocessingShape" mc:Ignorable="w14 w15 w16se w16cid w16 w16cex w16sdtdh w16sdtfl w16du wp14">
   <w:abstractNum w:abstractNumId="0" w15:restartNumberingAfterBreak="0">
+    <w:nsid w:val="130B38A7"/>
+    <w:multiLevelType w:val="multilevel"/>
+    <w:tmpl w:val="22E62EB4"/>
+    <w:lvl w:ilvl="0">
+      <w:start w:val="1"/>
+      <w:numFmt w:val="bullet"/>
+      <w:lvlText w:val=""/>
+      <w:lvlJc w:val="left"/>
+      <w:pPr>
+        <w:tabs>
+          <w:tab w:val="num" w:pos="720"/>
+        </w:tabs>
+        <w:ind w:left="720" w:hanging="360"/>
+      </w:pPr>
+      <w:rPr>
+        <w:rFonts w:ascii="Symbol" w:hAnsi="Symbol" w:hint="default"/>
+        <w:sz w:val="20"/>
+      </w:rPr>
+    </w:lvl>
+    <w:lvl w:ilvl="1" w:tentative="1">
+      <w:start w:val="1"/>
+      <w:numFmt w:val="bullet"/>
+      <w:lvlText w:val="o"/>
+      <w:lvlJc w:val="left"/>
+      <w:pPr>
+        <w:tabs>
+          <w:tab w:val="num" w:pos="1440"/>
+        </w:tabs>
+        <w:ind w:left="1440" w:hanging="360"/>
+      </w:pPr>
+      <w:rPr>
+        <w:rFonts w:ascii="Courier New" w:hAnsi="Courier New" w:hint="default"/>
+        <w:sz w:val="20"/>
+      </w:rPr>
+    </w:lvl>
+    <w:lvl w:ilvl="2" w:tentative="1">
+      <w:start w:val="1"/>
+      <w:numFmt w:val="bullet"/>
+      <w:lvlText w:val=""/>
+      <w:lvlJc w:val="left"/>
+      <w:pPr>
+        <w:tabs>
+          <w:tab w:val="num" w:pos="2160"/>
+        </w:tabs>
+        <w:ind w:left="2160" w:hanging="360"/>
+      </w:pPr>
+      <w:rPr>
+        <w:rFonts w:ascii="Wingdings" w:hAnsi="Wingdings" w:hint="default"/>
+        <w:sz w:val="20"/>
+      </w:rPr>
+    </w:lvl>
+    <w:lvl w:ilvl="3" w:tentative="1">
+      <w:start w:val="1"/>
+      <w:numFmt w:val="bullet"/>
+      <w:lvlText w:val=""/>
+      <w:lvlJc w:val="left"/>
+      <w:pPr>
+        <w:tabs>
+          <w:tab w:val="num" w:pos="2880"/>
+        </w:tabs>
+        <w:ind w:left="2880" w:hanging="360"/>
+      </w:pPr>
+      <w:rPr>
+        <w:rFonts w:ascii="Wingdings" w:hAnsi="Wingdings" w:hint="default"/>
+        <w:sz w:val="20"/>
+      </w:rPr>
+    </w:lvl>
+    <w:lvl w:ilvl="4" w:tentative="1">
+      <w:start w:val="1"/>
+      <w:numFmt w:val="bullet"/>
+      <w:lvlText w:val=""/>
+      <w:lvlJc w:val="left"/>
+      <w:pPr>
+        <w:tabs>
+          <w:tab w:val="num" w:pos="3600"/>
+        </w:tabs>
+        <w:ind w:left="3600" w:hanging="360"/>
+      </w:pPr>
+      <w:rPr>
+        <w:rFonts w:ascii="Wingdings" w:hAnsi="Wingdings" w:hint="default"/>
+        <w:sz w:val="20"/>
+      </w:rPr>
+    </w:lvl>
+    <w:lvl w:ilvl="5" w:tentative="1">
+      <w:start w:val="1"/>
+      <w:numFmt w:val="bullet"/>
+      <w:lvlText w:val=""/>
+      <w:lvlJc w:val="left"/>
+      <w:pPr>
+        <w:tabs>
+          <w:tab w:val="num" w:pos="4320"/>
+        </w:tabs>
+        <w:ind w:left="4320" w:hanging="360"/>
+      </w:pPr>
+      <w:rPr>
+        <w:rFonts w:ascii="Wingdings" w:hAnsi="Wingdings" w:hint="default"/>
+        <w:sz w:val="20"/>
+      </w:rPr>
+    </w:lvl>
+    <w:lvl w:ilvl="6" w:tentative="1">
+      <w:start w:val="1"/>
+      <w:numFmt w:val="bullet"/>
+      <w:lvlText w:val=""/>
+      <w:lvlJc w:val="left"/>
+      <w:pPr>
+        <w:tabs>
+          <w:tab w:val="num" w:pos="5040"/>
+        </w:tabs>
+        <w:ind w:left="5040" w:hanging="360"/>
+      </w:pPr>
+      <w:rPr>
+        <w:rFonts w:ascii="Wingdings" w:hAnsi="Wingdings" w:hint="default"/>
+        <w:sz w:val="20"/>
+      </w:rPr>
+    </w:lvl>
+    <w:lvl w:ilvl="7" w:tentative="1">
+      <w:start w:val="1"/>
+      <w:numFmt w:val="bullet"/>
+      <w:lvlText w:val=""/>
+      <w:lvlJc w:val="left"/>
+      <w:pPr>
+        <w:tabs>
+          <w:tab w:val="num" w:pos="5760"/>
+        </w:tabs>
+        <w:ind w:left="5760" w:hanging="360"/>
+      </w:pPr>
+      <w:rPr>
+        <w:rFonts w:ascii="Wingdings" w:hAnsi="Wingdings" w:hint="default"/>
+        <w:sz w:val="20"/>
+      </w:rPr>
+    </w:lvl>
+    <w:lvl w:ilvl="8" w:tentative="1">
+      <w:start w:val="1"/>
+      <w:numFmt w:val="bullet"/>
+      <w:lvlText w:val=""/>
+      <w:lvlJc w:val="left"/>
+      <w:pPr>
+        <w:tabs>
+          <w:tab w:val="num" w:pos="6480"/>
+        </w:tabs>
+        <w:ind w:left="6480" w:hanging="360"/>
+      </w:pPr>
+      <w:rPr>
+        <w:rFonts w:ascii="Wingdings" w:hAnsi="Wingdings" w:hint="default"/>
+        <w:sz w:val="20"/>
+      </w:rPr>
+    </w:lvl>
+  </w:abstractNum>
+  <w:abstractNum w:abstractNumId="1" w15:restartNumberingAfterBreak="0">
+    <w:nsid w:val="1971331D"/>
+    <w:multiLevelType w:val="multilevel"/>
+    <w:tmpl w:val="1902DD74"/>
+    <w:lvl w:ilvl="0">
+      <w:start w:val="1"/>
+      <w:numFmt w:val="bullet"/>
+      <w:lvlText w:val=""/>
+      <w:lvlJc w:val="left"/>
+      <w:pPr>
+        <w:tabs>
+          <w:tab w:val="num" w:pos="720"/>
+        </w:tabs>
+        <w:ind w:left="720" w:hanging="360"/>
+      </w:pPr>
+      <w:rPr>
+        <w:rFonts w:ascii="Symbol" w:hAnsi="Symbol" w:hint="default"/>
+        <w:sz w:val="20"/>
+      </w:rPr>
+    </w:lvl>
+    <w:lvl w:ilvl="1" w:tentative="1">
+      <w:start w:val="1"/>
+      <w:numFmt w:val="bullet"/>
+      <w:lvlText w:val="o"/>
+      <w:lvlJc w:val="left"/>
+      <w:pPr>
+        <w:tabs>
+          <w:tab w:val="num" w:pos="1440"/>
+        </w:tabs>
+        <w:ind w:left="1440" w:hanging="360"/>
+      </w:pPr>
+      <w:rPr>
+        <w:rFonts w:ascii="Courier New" w:hAnsi="Courier New" w:hint="default"/>
+        <w:sz w:val="20"/>
+      </w:rPr>
+    </w:lvl>
+    <w:lvl w:ilvl="2" w:tentative="1">
+      <w:start w:val="1"/>
+      <w:numFmt w:val="bullet"/>
+      <w:lvlText w:val=""/>
+      <w:lvlJc w:val="left"/>
+      <w:pPr>
+        <w:tabs>
+          <w:tab w:val="num" w:pos="2160"/>
+        </w:tabs>
+        <w:ind w:left="2160" w:hanging="360"/>
+      </w:pPr>
+      <w:rPr>
+        <w:rFonts w:ascii="Wingdings" w:hAnsi="Wingdings" w:hint="default"/>
+        <w:sz w:val="20"/>
+      </w:rPr>
+    </w:lvl>
+    <w:lvl w:ilvl="3" w:tentative="1">
+      <w:start w:val="1"/>
+      <w:numFmt w:val="bullet"/>
+      <w:lvlText w:val=""/>
+      <w:lvlJc w:val="left"/>
+      <w:pPr>
+        <w:tabs>
+          <w:tab w:val="num" w:pos="2880"/>
+        </w:tabs>
+        <w:ind w:left="2880" w:hanging="360"/>
+      </w:pPr>
+      <w:rPr>
+        <w:rFonts w:ascii="Wingdings" w:hAnsi="Wingdings" w:hint="default"/>
+        <w:sz w:val="20"/>
+      </w:rPr>
+    </w:lvl>
+    <w:lvl w:ilvl="4" w:tentative="1">
+      <w:start w:val="1"/>
+      <w:numFmt w:val="bullet"/>
+      <w:lvlText w:val=""/>
+      <w:lvlJc w:val="left"/>
+      <w:pPr>
+        <w:tabs>
+          <w:tab w:val="num" w:pos="3600"/>
+        </w:tabs>
+        <w:ind w:left="3600" w:hanging="360"/>
+      </w:pPr>
+      <w:rPr>
+        <w:rFonts w:ascii="Wingdings" w:hAnsi="Wingdings" w:hint="default"/>
+        <w:sz w:val="20"/>
+      </w:rPr>
+    </w:lvl>
+    <w:lvl w:ilvl="5" w:tentative="1">
+      <w:start w:val="1"/>
+      <w:numFmt w:val="bullet"/>
+      <w:lvlText w:val=""/>
+      <w:lvlJc w:val="left"/>
+      <w:pPr>
+        <w:tabs>
+          <w:tab w:val="num" w:pos="4320"/>
+        </w:tabs>
+        <w:ind w:left="4320" w:hanging="360"/>
+      </w:pPr>
+      <w:rPr>
+        <w:rFonts w:ascii="Wingdings" w:hAnsi="Wingdings" w:hint="default"/>
+        <w:sz w:val="20"/>
+      </w:rPr>
+    </w:lvl>
+    <w:lvl w:ilvl="6" w:tentative="1">
+      <w:start w:val="1"/>
+      <w:numFmt w:val="bullet"/>
+      <w:lvlText w:val=""/>
+      <w:lvlJc w:val="left"/>
+      <w:pPr>
+        <w:tabs>
+          <w:tab w:val="num" w:pos="5040"/>
+        </w:tabs>
+        <w:ind w:left="5040" w:hanging="360"/>
+      </w:pPr>
+      <w:rPr>
+        <w:rFonts w:ascii="Wingdings" w:hAnsi="Wingdings" w:hint="default"/>
+        <w:sz w:val="20"/>
+      </w:rPr>
+    </w:lvl>
+    <w:lvl w:ilvl="7" w:tentative="1">
+      <w:start w:val="1"/>
+      <w:numFmt w:val="bullet"/>
+      <w:lvlText w:val=""/>
+      <w:lvlJc w:val="left"/>
+      <w:pPr>
+        <w:tabs>
+          <w:tab w:val="num" w:pos="5760"/>
+        </w:tabs>
+        <w:ind w:left="5760" w:hanging="360"/>
+      </w:pPr>
+      <w:rPr>
+        <w:rFonts w:ascii="Wingdings" w:hAnsi="Wingdings" w:hint="default"/>
+        <w:sz w:val="20"/>
+      </w:rPr>
+    </w:lvl>
+    <w:lvl w:ilvl="8" w:tentative="1">
+      <w:start w:val="1"/>
+      <w:numFmt w:val="bullet"/>
+      <w:lvlText w:val=""/>
+      <w:lvlJc w:val="left"/>
+      <w:pPr>
+        <w:tabs>
+          <w:tab w:val="num" w:pos="6480"/>
+        </w:tabs>
+        <w:ind w:left="6480" w:hanging="360"/>
+      </w:pPr>
+      <w:rPr>
+        <w:rFonts w:ascii="Wingdings" w:hAnsi="Wingdings" w:hint="default"/>
+        <w:sz w:val="20"/>
+      </w:rPr>
+    </w:lvl>
+  </w:abstractNum>
+  <w:abstractNum w:abstractNumId="2" w15:restartNumberingAfterBreak="0">
+    <w:nsid w:val="4DDA5C9C"/>
+    <w:multiLevelType w:val="multilevel"/>
+    <w:tmpl w:val="280812A0"/>
+    <w:lvl w:ilvl="0">
+      <w:start w:val="1"/>
+      <w:numFmt w:val="bullet"/>
+      <w:lvlText w:val=""/>
+      <w:lvlJc w:val="left"/>
+      <w:pPr>
+        <w:tabs>
+          <w:tab w:val="num" w:pos="720"/>
+        </w:tabs>
+        <w:ind w:left="720" w:hanging="360"/>
+      </w:pPr>
+      <w:rPr>
+        <w:rFonts w:ascii="Symbol" w:hAnsi="Symbol" w:hint="default"/>
+        <w:sz w:val="20"/>
+      </w:rPr>
+    </w:lvl>
+    <w:lvl w:ilvl="1" w:tentative="1">
+      <w:start w:val="1"/>
+      <w:numFmt w:val="bullet"/>
+      <w:lvlText w:val="o"/>
+      <w:lvlJc w:val="left"/>
+      <w:pPr>
+        <w:tabs>
+          <w:tab w:val="num" w:pos="1440"/>
+        </w:tabs>
+        <w:ind w:left="1440" w:hanging="360"/>
+      </w:pPr>
+      <w:rPr>
+        <w:rFonts w:ascii="Courier New" w:hAnsi="Courier New" w:hint="default"/>
+        <w:sz w:val="20"/>
+      </w:rPr>
+    </w:lvl>
+    <w:lvl w:ilvl="2" w:tentative="1">
+      <w:start w:val="1"/>
+      <w:numFmt w:val="bullet"/>
+      <w:lvlText w:val=""/>
+      <w:lvlJc w:val="left"/>
+      <w:pPr>
+        <w:tabs>
+          <w:tab w:val="num" w:pos="2160"/>
+        </w:tabs>
+        <w:ind w:left="2160" w:hanging="360"/>
+      </w:pPr>
+      <w:rPr>
+        <w:rFonts w:ascii="Wingdings" w:hAnsi="Wingdings" w:hint="default"/>
+        <w:sz w:val="20"/>
+      </w:rPr>
+    </w:lvl>
+    <w:lvl w:ilvl="3" w:tentative="1">
+      <w:start w:val="1"/>
+      <w:numFmt w:val="bullet"/>
+      <w:lvlText w:val=""/>
+      <w:lvlJc w:val="left"/>
+      <w:pPr>
+        <w:tabs>
+          <w:tab w:val="num" w:pos="2880"/>
+        </w:tabs>
+        <w:ind w:left="2880" w:hanging="360"/>
+      </w:pPr>
+      <w:rPr>
+        <w:rFonts w:ascii="Wingdings" w:hAnsi="Wingdings" w:hint="default"/>
+        <w:sz w:val="20"/>
+      </w:rPr>
+    </w:lvl>
+    <w:lvl w:ilvl="4" w:tentative="1">
+      <w:start w:val="1"/>
+      <w:numFmt w:val="bullet"/>
+      <w:lvlText w:val=""/>
+      <w:lvlJc w:val="left"/>
+      <w:pPr>
+        <w:tabs>
+          <w:tab w:val="num" w:pos="3600"/>
+        </w:tabs>
+        <w:ind w:left="3600" w:hanging="360"/>
+      </w:pPr>
+      <w:rPr>
+        <w:rFonts w:ascii="Wingdings" w:hAnsi="Wingdings" w:hint="default"/>
+        <w:sz w:val="20"/>
+      </w:rPr>
+    </w:lvl>
+    <w:lvl w:ilvl="5" w:tentative="1">
+      <w:start w:val="1"/>
+      <w:numFmt w:val="bullet"/>
+      <w:lvlText w:val=""/>
+      <w:lvlJc w:val="left"/>
+      <w:pPr>
+        <w:tabs>
+          <w:tab w:val="num" w:pos="4320"/>
+        </w:tabs>
+        <w:ind w:left="4320" w:hanging="360"/>
+      </w:pPr>
+      <w:rPr>
+        <w:rFonts w:ascii="Wingdings" w:hAnsi="Wingdings" w:hint="default"/>
+        <w:sz w:val="20"/>
+      </w:rPr>
+    </w:lvl>
+    <w:lvl w:ilvl="6" w:tentative="1">
+      <w:start w:val="1"/>
+      <w:numFmt w:val="bullet"/>
+      <w:lvlText w:val=""/>
+      <w:lvlJc w:val="left"/>
+      <w:pPr>
+        <w:tabs>
+          <w:tab w:val="num" w:pos="5040"/>
+        </w:tabs>
+        <w:ind w:left="5040" w:hanging="360"/>
+      </w:pPr>
+      <w:rPr>
+        <w:rFonts w:ascii="Wingdings" w:hAnsi="Wingdings" w:hint="default"/>
+        <w:sz w:val="20"/>
+      </w:rPr>
+    </w:lvl>
+    <w:lvl w:ilvl="7" w:tentative="1">
+      <w:start w:val="1"/>
+      <w:numFmt w:val="bullet"/>
+      <w:lvlText w:val=""/>
+      <w:lvlJc w:val="left"/>
+      <w:pPr>
+        <w:tabs>
+          <w:tab w:val="num" w:pos="5760"/>
+        </w:tabs>
+        <w:ind w:left="5760" w:hanging="360"/>
+      </w:pPr>
+      <w:rPr>
+        <w:rFonts w:ascii="Wingdings" w:hAnsi="Wingdings" w:hint="default"/>
+        <w:sz w:val="20"/>
+      </w:rPr>
+    </w:lvl>
+    <w:lvl w:ilvl="8" w:tentative="1">
+      <w:start w:val="1"/>
+      <w:numFmt w:val="bullet"/>
+      <w:lvlText w:val=""/>
+      <w:lvlJc w:val="left"/>
+      <w:pPr>
+        <w:tabs>
+          <w:tab w:val="num" w:pos="6480"/>
+        </w:tabs>
+        <w:ind w:left="6480" w:hanging="360"/>
+      </w:pPr>
+      <w:rPr>
+        <w:rFonts w:ascii="Wingdings" w:hAnsi="Wingdings" w:hint="default"/>
+        <w:sz w:val="20"/>
+      </w:rPr>
+    </w:lvl>
+  </w:abstractNum>
+  <w:abstractNum w:abstractNumId="3" w15:restartNumberingAfterBreak="0">
+    <w:nsid w:val="4F7D32D5"/>
+    <w:multiLevelType w:val="multilevel"/>
+    <w:tmpl w:val="CA129F62"/>
+    <w:lvl w:ilvl="0">
+      <w:start w:val="1"/>
+      <w:numFmt w:val="bullet"/>
+      <w:lvlText w:val=""/>
+      <w:lvlJc w:val="left"/>
+      <w:pPr>
+        <w:tabs>
+          <w:tab w:val="num" w:pos="720"/>
+        </w:tabs>
+        <w:ind w:left="720" w:hanging="360"/>
+      </w:pPr>
+      <w:rPr>
+        <w:rFonts w:ascii="Symbol" w:hAnsi="Symbol" w:hint="default"/>
+        <w:sz w:val="20"/>
+      </w:rPr>
+    </w:lvl>
+    <w:lvl w:ilvl="1" w:tentative="1">
+      <w:start w:val="1"/>
+      <w:numFmt w:val="bullet"/>
+      <w:lvlText w:val="o"/>
+      <w:lvlJc w:val="left"/>
+      <w:pPr>
+        <w:tabs>
+          <w:tab w:val="num" w:pos="1440"/>
+        </w:tabs>
+        <w:ind w:left="1440" w:hanging="360"/>
+      </w:pPr>
+      <w:rPr>
+        <w:rFonts w:ascii="Courier New" w:hAnsi="Courier New" w:hint="default"/>
+        <w:sz w:val="20"/>
+      </w:rPr>
+    </w:lvl>
+    <w:lvl w:ilvl="2" w:tentative="1">
+      <w:start w:val="1"/>
+      <w:numFmt w:val="bullet"/>
+      <w:lvlText w:val=""/>
+      <w:lvlJc w:val="left"/>
+      <w:pPr>
+        <w:tabs>
+          <w:tab w:val="num" w:pos="2160"/>
+        </w:tabs>
+        <w:ind w:left="2160" w:hanging="360"/>
+      </w:pPr>
+      <w:rPr>
+        <w:rFonts w:ascii="Wingdings" w:hAnsi="Wingdings" w:hint="default"/>
+        <w:sz w:val="20"/>
+      </w:rPr>
+    </w:lvl>
+    <w:lvl w:ilvl="3" w:tentative="1">
+      <w:start w:val="1"/>
+      <w:numFmt w:val="bullet"/>
+      <w:lvlText w:val=""/>
+      <w:lvlJc w:val="left"/>
+      <w:pPr>
+        <w:tabs>
+          <w:tab w:val="num" w:pos="2880"/>
+        </w:tabs>
+        <w:ind w:left="2880" w:hanging="360"/>
+      </w:pPr>
+      <w:rPr>
+        <w:rFonts w:ascii="Wingdings" w:hAnsi="Wingdings" w:hint="default"/>
+        <w:sz w:val="20"/>
+      </w:rPr>
+    </w:lvl>
+    <w:lvl w:ilvl="4" w:tentative="1">
+      <w:start w:val="1"/>
+      <w:numFmt w:val="bullet"/>
+      <w:lvlText w:val=""/>
+      <w:lvlJc w:val="left"/>
+      <w:pPr>
+        <w:tabs>
+          <w:tab w:val="num" w:pos="3600"/>
+        </w:tabs>
+        <w:ind w:left="3600" w:hanging="360"/>
+      </w:pPr>
+      <w:rPr>
+        <w:rFonts w:ascii="Wingdings" w:hAnsi="Wingdings" w:hint="default"/>
+        <w:sz w:val="20"/>
+      </w:rPr>
+    </w:lvl>
+    <w:lvl w:ilvl="5" w:tentative="1">
+      <w:start w:val="1"/>
+      <w:numFmt w:val="bullet"/>
+      <w:lvlText w:val=""/>
+      <w:lvlJc w:val="left"/>
+      <w:pPr>
+        <w:tabs>
+          <w:tab w:val="num" w:pos="4320"/>
+        </w:tabs>
+        <w:ind w:left="4320" w:hanging="360"/>
+      </w:pPr>
+      <w:rPr>
+        <w:rFonts w:ascii="Wingdings" w:hAnsi="Wingdings" w:hint="default"/>
+        <w:sz w:val="20"/>
+      </w:rPr>
+    </w:lvl>
+    <w:lvl w:ilvl="6" w:tentative="1">
+      <w:start w:val="1"/>
+      <w:numFmt w:val="bullet"/>
+      <w:lvlText w:val=""/>
+      <w:lvlJc w:val="left"/>
+      <w:pPr>
+        <w:tabs>
+          <w:tab w:val="num" w:pos="5040"/>
+        </w:tabs>
+        <w:ind w:left="5040" w:hanging="360"/>
+      </w:pPr>
+      <w:rPr>
+        <w:rFonts w:ascii="Wingdings" w:hAnsi="Wingdings" w:hint="default"/>
+        <w:sz w:val="20"/>
+      </w:rPr>
+    </w:lvl>
+    <w:lvl w:ilvl="7" w:tentative="1">
+      <w:start w:val="1"/>
+      <w:numFmt w:val="bullet"/>
+      <w:lvlText w:val=""/>
+      <w:lvlJc w:val="left"/>
+      <w:pPr>
+        <w:tabs>
+          <w:tab w:val="num" w:pos="5760"/>
+        </w:tabs>
+        <w:ind w:left="5760" w:hanging="360"/>
+      </w:pPr>
+      <w:rPr>
+        <w:rFonts w:ascii="Wingdings" w:hAnsi="Wingdings" w:hint="default"/>
+        <w:sz w:val="20"/>
+      </w:rPr>
+    </w:lvl>
+    <w:lvl w:ilvl="8" w:tentative="1">
+      <w:start w:val="1"/>
+      <w:numFmt w:val="bullet"/>
+      <w:lvlText w:val=""/>
+      <w:lvlJc w:val="left"/>
+      <w:pPr>
+        <w:tabs>
+          <w:tab w:val="num" w:pos="6480"/>
+        </w:tabs>
+        <w:ind w:left="6480" w:hanging="360"/>
+      </w:pPr>
+      <w:rPr>
+        <w:rFonts w:ascii="Wingdings" w:hAnsi="Wingdings" w:hint="default"/>
+        <w:sz w:val="20"/>
+      </w:rPr>
+    </w:lvl>
+  </w:abstractNum>
+  <w:abstractNum w:abstractNumId="4" w15:restartNumberingAfterBreak="0">
     <w:nsid w:val="74A24BAA"/>
     <w:multiLevelType w:val="hybridMultilevel"/>
     <w:tmpl w:val="D29C339E"/>
@@ -1350,10 +2158,22 @@
     </w:lvl>
   </w:abstractNum>
   <w:num w:numId="1" w16cid:durableId="196742382">
-    <w:abstractNumId w:val="0"/>
+    <w:abstractNumId w:val="4"/>
     <w:lvlOverride w:ilvl="0">
       <w:startOverride w:val="1"/>
     </w:lvlOverride>
+  </w:num>
+  <w:num w:numId="2" w16cid:durableId="341056024">
+    <w:abstractNumId w:val="0"/>
+  </w:num>
+  <w:num w:numId="3" w16cid:durableId="1883396517">
+    <w:abstractNumId w:val="3"/>
+  </w:num>
+  <w:num w:numId="4" w16cid:durableId="87626389">
+    <w:abstractNumId w:val="2"/>
+  </w:num>
+  <w:num w:numId="5" w16cid:durableId="646789602">
+    <w:abstractNumId w:val="1"/>
   </w:num>
 </w:numbering>
 </file>
@@ -1838,7 +2658,6 @@
   <w:style w:type="character" w:default="1" w:styleId="DefaultParagraphFont">
     <w:name w:val="Default Paragraph Font"/>
     <w:uiPriority w:val="1"/>
-    <w:semiHidden/>
     <w:unhideWhenUsed/>
   </w:style>
   <w:style w:type="table" w:default="1" w:styleId="TableNormal">
@@ -2039,12 +2858,33 @@
 
 <file path=word/glossary/fontTable.xml><?xml version="1.0" encoding="utf-8"?>
 <w:fonts xmlns:mc="http://schemas.openxmlformats.org/markup-compatibility/2006" xmlns:r="http://schemas.openxmlformats.org/officeDocument/2006/relationships" xmlns:w="http://schemas.openxmlformats.org/wordprocessingml/2006/main" xmlns:w14="http://schemas.microsoft.com/office/word/2010/wordml" xmlns:w15="http://schemas.microsoft.com/office/word/2012/wordml" xmlns:w16cex="http://schemas.microsoft.com/office/word/2018/wordml/cex" xmlns:w16cid="http://schemas.microsoft.com/office/word/2016/wordml/cid" xmlns:w16="http://schemas.microsoft.com/office/word/2018/wordml" xmlns:w16du="http://schemas.microsoft.com/office/word/2023/wordml/word16du" xmlns:w16sdtdh="http://schemas.microsoft.com/office/word/2020/wordml/sdtdatahash" xmlns:w16sdtfl="http://schemas.microsoft.com/office/word/2024/wordml/sdtformatlock" xmlns:w16se="http://schemas.microsoft.com/office/word/2015/wordml/symex" mc:Ignorable="w14 w15 w16se w16cid w16 w16cex w16sdtdh w16sdtfl w16du">
+  <w:font w:name="Symbol">
+    <w:panose1 w:val="05050102010706020507"/>
+    <w:charset w:val="02"/>
+    <w:family w:val="roman"/>
+    <w:pitch w:val="variable"/>
+    <w:sig w:usb0="00000000" w:usb1="10000000" w:usb2="00000000" w:usb3="00000000" w:csb0="80000000" w:csb1="00000000"/>
+  </w:font>
   <w:font w:name="Times New Roman">
     <w:panose1 w:val="02020603050405020304"/>
     <w:charset w:val="00"/>
     <w:family w:val="roman"/>
     <w:pitch w:val="variable"/>
     <w:sig w:usb0="E0002EFF" w:usb1="C000785B" w:usb2="00000009" w:usb3="00000000" w:csb0="000001FF" w:csb1="00000000"/>
+  </w:font>
+  <w:font w:name="Courier New">
+    <w:panose1 w:val="02070309020205020404"/>
+    <w:charset w:val="00"/>
+    <w:family w:val="modern"/>
+    <w:pitch w:val="fixed"/>
+    <w:sig w:usb0="E0002EFF" w:usb1="C0007843" w:usb2="00000009" w:usb3="00000000" w:csb0="000001FF" w:csb1="00000000"/>
+  </w:font>
+  <w:font w:name="Wingdings">
+    <w:panose1 w:val="05000000000000000000"/>
+    <w:charset w:val="02"/>
+    <w:family w:val="auto"/>
+    <w:pitch w:val="variable"/>
+    <w:sig w:usb0="00000000" w:usb1="10000000" w:usb2="00000000" w:usb3="00000000" w:csb0="80000000" w:csb1="00000000"/>
   </w:font>
   <w:font w:name="Georgia">
     <w:panose1 w:val="02040502050405020303"/>
@@ -2084,10 +2924,12 @@
   </w:compat>
   <w:rsids>
     <w:rsidRoot w:val="00FC5C35"/>
+    <w:rsid w:val="001264B7"/>
     <w:rsid w:val="001E128A"/>
     <w:rsid w:val="003F3BBE"/>
     <w:rsid w:val="009F120F"/>
     <w:rsid w:val="00BF1EC2"/>
+    <w:rsid w:val="00C32501"/>
     <w:rsid w:val="00D53A01"/>
     <w:rsid w:val="00E207E2"/>
     <w:rsid w:val="00F55CA3"/>

</xml_diff>

<commit_message>
Add Sprint 1 documentation
Sprint 1 burndown chart, product backlog, presentation, wiki screenshots,
and updated Sprint 0 deck and team working agreement.
</commit_message>
<xml_diff>
--- a/Doumentation/Team Agremment/Team-Working-Agreement.docx
+++ b/Doumentation/Team Agremment/Team-Working-Agreement.docx
@@ -598,8 +598,6 @@
           <w:bottom w:val="single" w:sz="6" w:space="4" w:color="1F3B73"/>
         </w:pBdr>
         <w:spacing w:before="300" w:after="150"/>
-      </w:pPr>
-      <w:r>
         <w:rPr>
           <w:b/>
           <w:bCs/>
@@ -607,7 +605,16 @@
           <w:sz w:val="28"/>
           <w:szCs w:val="28"/>
         </w:rPr>
-        <w:t>Team Principles</w:t>
+      </w:pPr>
+      <w:r>
+        <w:rPr>
+          <w:b/>
+          <w:bCs/>
+          <w:color w:val="1F3B73"/>
+          <w:sz w:val="28"/>
+          <w:szCs w:val="28"/>
+        </w:rPr>
+        <w:t>1. Communication &amp; Collaboration</w:t>
       </w:r>
     </w:p>
     <w:p>
@@ -620,7 +627,14 @@
         <w:spacing w:after="80"/>
       </w:pPr>
       <w:r>
-        <w:t>Respectful, timely, and transparent communication</w:t>
+        <w:rPr>
+          <w:b/>
+          <w:bCs/>
+        </w:rPr>
+        <w:t>Communication Channels:</w:t>
+      </w:r>
+      <w:r>
+        <w:t xml:space="preserve"> Use Zoom for meetings and technical discussions, WhatsApp for quick updates, GitHub for code, and GitHub Wiki for documentation.</w:t>
       </w:r>
     </w:p>
     <w:p>
@@ -633,7 +647,14 @@
         <w:spacing w:after="80"/>
       </w:pPr>
       <w:r>
-        <w:t>Clear ownership with cross-component collaboration</w:t>
+        <w:rPr>
+          <w:b/>
+          <w:bCs/>
+        </w:rPr>
+        <w:t>Respect</w:t>
+      </w:r>
+      <w:r>
+        <w:t>: Respect everyone's opinions. Discuss major changes with the team before making them.</w:t>
       </w:r>
     </w:p>
     <w:p>
@@ -646,7 +667,40 @@
         <w:spacing w:after="80"/>
       </w:pPr>
       <w:r>
-        <w:t>Balanced workload and early escalation of blockers</w:t>
+        <w:rPr>
+          <w:b/>
+          <w:bCs/>
+        </w:rPr>
+        <w:t>Conflict Resolution:</w:t>
+      </w:r>
+      <w:r>
+        <w:t xml:space="preserve"> Discuss different solutions, share research, and vote to make the final decision.</w:t>
+      </w:r>
+    </w:p>
+    <w:p>
+      <w:pPr>
+        <w:pStyle w:val="Heading1"/>
+        <w:pBdr>
+          <w:bottom w:val="single" w:sz="6" w:space="4" w:color="1F3B73"/>
+        </w:pBdr>
+        <w:spacing w:before="300" w:after="150"/>
+        <w:rPr>
+          <w:b/>
+          <w:bCs/>
+          <w:color w:val="1F3B73"/>
+          <w:sz w:val="28"/>
+          <w:szCs w:val="28"/>
+        </w:rPr>
+      </w:pPr>
+      <w:r>
+        <w:rPr>
+          <w:b/>
+          <w:bCs/>
+          <w:color w:val="1F3B73"/>
+          <w:sz w:val="28"/>
+          <w:szCs w:val="28"/>
+        </w:rPr>
+        <w:t>2. Meeting Schedule</w:t>
       </w:r>
     </w:p>
     <w:p>
@@ -659,15 +713,14 @@
         <w:spacing w:after="80"/>
       </w:pPr>
       <w:r>
-        <w:t xml:space="preserve">Use GitHub issues, </w:t>
-      </w:r>
-      <w:proofErr w:type="gramStart"/>
-      <w:r>
-        <w:t>branches</w:t>
-      </w:r>
-      <w:proofErr w:type="gramEnd"/>
-      <w:r>
-        <w:t>, and pull requests</w:t>
+        <w:rPr>
+          <w:b/>
+          <w:bCs/>
+        </w:rPr>
+        <w:t>Meetings</w:t>
+      </w:r>
+      <w:r>
+        <w:t>: Meet twice a week.</w:t>
       </w:r>
     </w:p>
     <w:p>
@@ -680,7 +733,14 @@
         <w:spacing w:after="80"/>
       </w:pPr>
       <w:r>
-        <w:t>Attend Scrum ceremonies and give honest status updates</w:t>
+        <w:rPr>
+          <w:b/>
+          <w:bCs/>
+        </w:rPr>
+        <w:t>Agenda</w:t>
+      </w:r>
+      <w:r>
+        <w:t>: Prepare an agenda before each meeting.</w:t>
       </w:r>
     </w:p>
     <w:p>
@@ -693,7 +753,14 @@
         <w:spacing w:after="80"/>
       </w:pPr>
       <w:r>
-        <w:t>Document technical decisions and important changes</w:t>
+        <w:rPr>
+          <w:b/>
+          <w:bCs/>
+        </w:rPr>
+        <w:t>Absences</w:t>
+      </w:r>
+      <w:r>
+        <w:t>: Inform the team in advance. Meetings may be recorded for absent members.</w:t>
       </w:r>
     </w:p>
     <w:p>
@@ -706,8 +773,229 @@
         <w:spacing w:after="80"/>
       </w:pPr>
       <w:r>
-        <w:t>Integrate frequently rather than waiting until sprint end</w:t>
-      </w:r>
+        <w:rPr>
+          <w:b/>
+          <w:bCs/>
+        </w:rPr>
+        <w:t>Sprints</w:t>
+      </w:r>
+      <w:r>
+        <w:t>: Plan the next sprint after the current one ends. Hold a retrospective meeting at the end of each sprint.</w:t>
+      </w:r>
+    </w:p>
+    <w:p>
+      <w:pPr>
+        <w:pStyle w:val="Heading1"/>
+        <w:pBdr>
+          <w:bottom w:val="single" w:sz="6" w:space="4" w:color="1F3B73"/>
+        </w:pBdr>
+        <w:spacing w:before="300" w:after="150"/>
+        <w:rPr>
+          <w:b/>
+          <w:bCs/>
+          <w:color w:val="1F3B73"/>
+          <w:sz w:val="28"/>
+          <w:szCs w:val="28"/>
+        </w:rPr>
+      </w:pPr>
+      <w:r>
+        <w:rPr>
+          <w:b/>
+          <w:bCs/>
+          <w:color w:val="1F3B73"/>
+          <w:sz w:val="28"/>
+          <w:szCs w:val="28"/>
+        </w:rPr>
+        <w:t>3. Teamwork &amp; Responsibilities</w:t>
+      </w:r>
+    </w:p>
+    <w:p>
+      <w:pPr>
+        <w:pStyle w:val="ListParagraph"/>
+        <w:numPr>
+          <w:ilvl w:val="0"/>
+          <w:numId w:val="1"/>
+        </w:numPr>
+        <w:spacing w:after="80"/>
+      </w:pPr>
+      <w:r>
+        <w:rPr>
+          <w:b/>
+          <w:bCs/>
+        </w:rPr>
+        <w:t>Workload</w:t>
+      </w:r>
+      <w:r>
+        <w:t>: Divide tasks fairly and break large tasks into smaller parts.</w:t>
+      </w:r>
+    </w:p>
+    <w:p>
+      <w:pPr>
+        <w:pStyle w:val="ListParagraph"/>
+        <w:numPr>
+          <w:ilvl w:val="0"/>
+          <w:numId w:val="1"/>
+        </w:numPr>
+        <w:spacing w:after="80"/>
+      </w:pPr>
+      <w:r>
+        <w:rPr>
+          <w:b/>
+          <w:bCs/>
+        </w:rPr>
+        <w:t>Blockers</w:t>
+      </w:r>
+      <w:r>
+        <w:t>: Try to solve problems independently and share what you have tried before asking for help.</w:t>
+      </w:r>
+    </w:p>
+    <w:p>
+      <w:pPr>
+        <w:pStyle w:val="ListParagraph"/>
+        <w:numPr>
+          <w:ilvl w:val="0"/>
+          <w:numId w:val="1"/>
+        </w:numPr>
+        <w:spacing w:after="80"/>
+      </w:pPr>
+      <w:r>
+        <w:rPr>
+          <w:b/>
+          <w:bCs/>
+        </w:rPr>
+        <w:t>Accountability</w:t>
+      </w:r>
+      <w:r>
+        <w:t>: Update Jira regularly and link tasks to GitHub commits or documents.</w:t>
+      </w:r>
+    </w:p>
+    <w:p>
+      <w:pPr>
+        <w:pStyle w:val="ListParagraph"/>
+        <w:numPr>
+          <w:ilvl w:val="0"/>
+          <w:numId w:val="1"/>
+        </w:numPr>
+        <w:spacing w:after="80"/>
+      </w:pPr>
+      <w:r>
+        <w:rPr>
+          <w:b/>
+          <w:bCs/>
+        </w:rPr>
+        <w:t>Respect</w:t>
+      </w:r>
+      <w:r>
+        <w:t>: Communicate politely and support one another.</w:t>
+      </w:r>
+    </w:p>
+    <w:p>
+      <w:pPr>
+        <w:pStyle w:val="Heading1"/>
+        <w:pBdr>
+          <w:bottom w:val="single" w:sz="6" w:space="4" w:color="1F3B73"/>
+        </w:pBdr>
+        <w:spacing w:before="300" w:after="150"/>
+        <w:rPr>
+          <w:b/>
+          <w:bCs/>
+          <w:color w:val="1F3B73"/>
+          <w:sz w:val="28"/>
+          <w:szCs w:val="28"/>
+        </w:rPr>
+      </w:pPr>
+      <w:r>
+        <w:rPr>
+          <w:b/>
+          <w:bCs/>
+          <w:color w:val="1F3B73"/>
+          <w:sz w:val="28"/>
+          <w:szCs w:val="28"/>
+        </w:rPr>
+        <w:t>4. GitHub Workflow</w:t>
+      </w:r>
+    </w:p>
+    <w:p>
+      <w:pPr>
+        <w:pStyle w:val="ListParagraph"/>
+        <w:numPr>
+          <w:ilvl w:val="0"/>
+          <w:numId w:val="1"/>
+        </w:numPr>
+        <w:spacing w:after="80"/>
+      </w:pPr>
+      <w:r>
+        <w:rPr>
+          <w:b/>
+          <w:bCs/>
+        </w:rPr>
+        <w:t>Code Updates</w:t>
+      </w:r>
+      <w:r>
+        <w:t>: Inform the team on WhatsApp before or after pushing code.</w:t>
+      </w:r>
+    </w:p>
+    <w:p>
+      <w:pPr>
+        <w:spacing w:after="80"/>
+      </w:pPr>
+    </w:p>
+    <w:p>
+      <w:pPr>
+        <w:pStyle w:val="ListParagraph"/>
+        <w:numPr>
+          <w:ilvl w:val="0"/>
+          <w:numId w:val="1"/>
+        </w:numPr>
+        <w:spacing w:after="80"/>
+      </w:pPr>
+      <w:r>
+        <w:rPr>
+          <w:b/>
+          <w:bCs/>
+        </w:rPr>
+        <w:lastRenderedPageBreak/>
+        <w:t>Conflicts</w:t>
+      </w:r>
+      <w:r>
+        <w:t>: Discuss changes that affect other team members' code before resolving them.</w:t>
+      </w:r>
+    </w:p>
+    <w:p>
+      <w:pPr>
+        <w:pStyle w:val="ListParagraph"/>
+        <w:numPr>
+          <w:ilvl w:val="0"/>
+          <w:numId w:val="1"/>
+        </w:numPr>
+        <w:spacing w:after="80"/>
+      </w:pPr>
+      <w:r>
+        <w:rPr>
+          <w:b/>
+          <w:bCs/>
+        </w:rPr>
+        <w:t>Branches &amp; Pull Requests</w:t>
+      </w:r>
+      <w:r>
+        <w:t>: Do not push directly to the main branch. Use feature branches and pull requests, with at least one team member reviewing and approving the changes.</w:t>
+      </w:r>
+    </w:p>
+    <w:p>
+      <w:pPr>
+        <w:pStyle w:val="Heading1"/>
+        <w:pBdr>
+          <w:bottom w:val="single" w:sz="6" w:space="4" w:color="1F3B73"/>
+        </w:pBdr>
+        <w:spacing w:before="300" w:after="150"/>
+        <w:rPr>
+          <w:b/>
+          <w:bCs/>
+          <w:color w:val="1F3B73"/>
+          <w:sz w:val="28"/>
+          <w:szCs w:val="28"/>
+        </w:rPr>
+      </w:pPr>
     </w:p>
     <w:p>
       <w:pPr>
@@ -836,83 +1124,6 @@
       <w:pPr>
         <w:spacing w:after="80"/>
       </w:pPr>
-    </w:p>
-    <w:p>
-      <w:pPr>
-        <w:spacing w:after="80"/>
-      </w:pPr>
-    </w:p>
-    <w:p>
-      <w:pPr>
-        <w:pStyle w:val="Heading1"/>
-        <w:pBdr>
-          <w:bottom w:val="single" w:sz="6" w:space="4" w:color="1F3B73"/>
-        </w:pBdr>
-        <w:spacing w:before="300" w:after="150"/>
-      </w:pPr>
-      <w:r>
-        <w:rPr>
-          <w:b/>
-          <w:bCs/>
-          <w:color w:val="1F3B73"/>
-          <w:sz w:val="28"/>
-          <w:szCs w:val="28"/>
-        </w:rPr>
-        <w:lastRenderedPageBreak/>
-        <w:t>Communication &amp; Meeting Norms</w:t>
-      </w:r>
-    </w:p>
-    <w:p>
-      <w:pPr>
-        <w:pStyle w:val="ListParagraph"/>
-        <w:numPr>
-          <w:ilvl w:val="0"/>
-          <w:numId w:val="1"/>
-        </w:numPr>
-        <w:spacing w:after="80"/>
-      </w:pPr>
-      <w:r>
-        <w:t>Daily async stand-up updates posted in the team channel</w:t>
-      </w:r>
-    </w:p>
-    <w:p>
-      <w:pPr>
-        <w:pStyle w:val="ListParagraph"/>
-        <w:numPr>
-          <w:ilvl w:val="0"/>
-          <w:numId w:val="1"/>
-        </w:numPr>
-        <w:spacing w:after="80"/>
-      </w:pPr>
-      <w:r>
-        <w:t>Weekly sprint planning and review meetings</w:t>
-      </w:r>
-    </w:p>
-    <w:p>
-      <w:pPr>
-        <w:pStyle w:val="ListParagraph"/>
-        <w:numPr>
-          <w:ilvl w:val="0"/>
-          <w:numId w:val="1"/>
-        </w:numPr>
-        <w:spacing w:after="80"/>
-      </w:pPr>
-      <w:r>
-        <w:t>Blockers escalated to the Scrum Master within 24 hours</w:t>
-      </w:r>
-    </w:p>
-    <w:p>
-      <w:pPr>
-        <w:pStyle w:val="ListParagraph"/>
-        <w:numPr>
-          <w:ilvl w:val="0"/>
-          <w:numId w:val="1"/>
-        </w:numPr>
-        <w:spacing w:after="80"/>
-      </w:pPr>
-      <w:r>
-        <w:t>All decisions affecting scope documented in the wiki or backlog</w:t>
-      </w:r>
     </w:p>
     <w:sectPr>
       <w:headerReference w:type="default" r:id="rId8"/>
@@ -1029,6 +1240,7 @@
           <w:dataBinding w:prefixMappings="xmlns:ns0='http://purl.org/dc/elements/1.1/' xmlns:ns1='http://schemas.openxmlformats.org/package/2006/metadata/core-properties' " w:xpath="/ns1:coreProperties[1]/ns0:creator[1]" w:storeItemID="{6C3C8BC8-F283-45AE-878A-BAB7291924A1}"/>
           <w:text/>
         </w:sdtPr>
+        <w:sdtEndPr/>
         <w:sdtContent>
           <w:tc>
             <w:tcPr>
@@ -1264,6 +1476,602 @@
 <file path=word/numbering.xml><?xml version="1.0" encoding="utf-8"?>
 <w:numbering xmlns:wpc="http://schemas.microsoft.com/office/word/2010/wordprocessingCanvas" xmlns:cx="http://schemas.microsoft.com/office/drawing/2014/chartex" xmlns:cx1="http://schemas.microsoft.com/office/drawing/2015/9/8/chartex" xmlns:cx2="http://schemas.microsoft.com/office/drawing/2015/10/21/chartex" xmlns:cx3="http://schemas.microsoft.com/office/drawing/2016/5/9/chartex" xmlns:cx4="http://schemas.microsoft.com/office/drawing/2016/5/10/chartex" xmlns:cx5="http://schemas.microsoft.com/office/drawing/2016/5/11/chartex" xmlns:cx6="http://schemas.microsoft.com/office/drawing/2016/5/12/chartex" xmlns:cx7="http://schemas.microsoft.com/office/drawing/2016/5/13/chartex" xmlns:cx8="http://schemas.microsoft.com/office/drawing/2016/5/14/chartex" xmlns:mc="http://schemas.openxmlformats.org/markup-compatibility/2006" xmlns:aink="http://schemas.microsoft.com/office/drawing/2016/ink" xmlns:am3d="http://schemas.microsoft.com/office/drawing/2017/model3d" xmlns:o="urn:schemas-microsoft-com:office:office" xmlns:oel="http://schemas.microsoft.com/office/2019/extlst" xmlns:r="http://schemas.openxmlformats.org/officeDocument/2006/relationships" xmlns:m="http://schemas.openxmlformats.org/officeDocument/2006/math" xmlns:v="urn:schemas-microsoft-com:vml" xmlns:wp14="http://schemas.microsoft.com/office/word/2010/wordprocessingDrawing" xmlns:wp="http://schemas.openxmlformats.org/drawingml/2006/wordprocessingDrawing" xmlns:w10="urn:schemas-microsoft-com:office:word" xmlns:w="http://schemas.openxmlformats.org/wordprocessingml/2006/main" xmlns:w14="http://schemas.microsoft.com/office/word/2010/wordml" xmlns:w15="http://schemas.microsoft.com/office/word/2012/wordml" xmlns:w16cex="http://schemas.microsoft.com/office/word/2018/wordml/cex" xmlns:w16cid="http://schemas.microsoft.com/office/word/2016/wordml/cid" xmlns:w16="http://schemas.microsoft.com/office/word/2018/wordml" xmlns:w16du="http://schemas.microsoft.com/office/word/2023/wordml/word16du" xmlns:w16sdtdh="http://schemas.microsoft.com/office/word/2020/wordml/sdtdatahash" xmlns:w16sdtfl="http://schemas.microsoft.com/office/word/2024/wordml/sdtformatlock" xmlns:w16se="http://schemas.microsoft.com/office/word/2015/wordml/symex" xmlns:wpg="http://schemas.microsoft.com/office/word/2010/wordprocessingGroup" xmlns:wpi="http://schemas.microsoft.com/office/word/2010/wordprocessingInk" xmlns:wne="http://schemas.microsoft.com/office/word/2006/wordml" xmlns:wps="http://schemas.microsoft.com/office/word/2010/wordprocessingShape" mc:Ignorable="w14 w15 w16se w16cid w16 w16cex w16sdtdh w16sdtfl w16du wp14">
   <w:abstractNum w:abstractNumId="0" w15:restartNumberingAfterBreak="0">
+    <w:nsid w:val="130B38A7"/>
+    <w:multiLevelType w:val="multilevel"/>
+    <w:tmpl w:val="22E62EB4"/>
+    <w:lvl w:ilvl="0">
+      <w:start w:val="1"/>
+      <w:numFmt w:val="bullet"/>
+      <w:lvlText w:val=""/>
+      <w:lvlJc w:val="left"/>
+      <w:pPr>
+        <w:tabs>
+          <w:tab w:val="num" w:pos="720"/>
+        </w:tabs>
+        <w:ind w:left="720" w:hanging="360"/>
+      </w:pPr>
+      <w:rPr>
+        <w:rFonts w:ascii="Symbol" w:hAnsi="Symbol" w:hint="default"/>
+        <w:sz w:val="20"/>
+      </w:rPr>
+    </w:lvl>
+    <w:lvl w:ilvl="1" w:tentative="1">
+      <w:start w:val="1"/>
+      <w:numFmt w:val="bullet"/>
+      <w:lvlText w:val="o"/>
+      <w:lvlJc w:val="left"/>
+      <w:pPr>
+        <w:tabs>
+          <w:tab w:val="num" w:pos="1440"/>
+        </w:tabs>
+        <w:ind w:left="1440" w:hanging="360"/>
+      </w:pPr>
+      <w:rPr>
+        <w:rFonts w:ascii="Courier New" w:hAnsi="Courier New" w:hint="default"/>
+        <w:sz w:val="20"/>
+      </w:rPr>
+    </w:lvl>
+    <w:lvl w:ilvl="2" w:tentative="1">
+      <w:start w:val="1"/>
+      <w:numFmt w:val="bullet"/>
+      <w:lvlText w:val=""/>
+      <w:lvlJc w:val="left"/>
+      <w:pPr>
+        <w:tabs>
+          <w:tab w:val="num" w:pos="2160"/>
+        </w:tabs>
+        <w:ind w:left="2160" w:hanging="360"/>
+      </w:pPr>
+      <w:rPr>
+        <w:rFonts w:ascii="Wingdings" w:hAnsi="Wingdings" w:hint="default"/>
+        <w:sz w:val="20"/>
+      </w:rPr>
+    </w:lvl>
+    <w:lvl w:ilvl="3" w:tentative="1">
+      <w:start w:val="1"/>
+      <w:numFmt w:val="bullet"/>
+      <w:lvlText w:val=""/>
+      <w:lvlJc w:val="left"/>
+      <w:pPr>
+        <w:tabs>
+          <w:tab w:val="num" w:pos="2880"/>
+        </w:tabs>
+        <w:ind w:left="2880" w:hanging="360"/>
+      </w:pPr>
+      <w:rPr>
+        <w:rFonts w:ascii="Wingdings" w:hAnsi="Wingdings" w:hint="default"/>
+        <w:sz w:val="20"/>
+      </w:rPr>
+    </w:lvl>
+    <w:lvl w:ilvl="4" w:tentative="1">
+      <w:start w:val="1"/>
+      <w:numFmt w:val="bullet"/>
+      <w:lvlText w:val=""/>
+      <w:lvlJc w:val="left"/>
+      <w:pPr>
+        <w:tabs>
+          <w:tab w:val="num" w:pos="3600"/>
+        </w:tabs>
+        <w:ind w:left="3600" w:hanging="360"/>
+      </w:pPr>
+      <w:rPr>
+        <w:rFonts w:ascii="Wingdings" w:hAnsi="Wingdings" w:hint="default"/>
+        <w:sz w:val="20"/>
+      </w:rPr>
+    </w:lvl>
+    <w:lvl w:ilvl="5" w:tentative="1">
+      <w:start w:val="1"/>
+      <w:numFmt w:val="bullet"/>
+      <w:lvlText w:val=""/>
+      <w:lvlJc w:val="left"/>
+      <w:pPr>
+        <w:tabs>
+          <w:tab w:val="num" w:pos="4320"/>
+        </w:tabs>
+        <w:ind w:left="4320" w:hanging="360"/>
+      </w:pPr>
+      <w:rPr>
+        <w:rFonts w:ascii="Wingdings" w:hAnsi="Wingdings" w:hint="default"/>
+        <w:sz w:val="20"/>
+      </w:rPr>
+    </w:lvl>
+    <w:lvl w:ilvl="6" w:tentative="1">
+      <w:start w:val="1"/>
+      <w:numFmt w:val="bullet"/>
+      <w:lvlText w:val=""/>
+      <w:lvlJc w:val="left"/>
+      <w:pPr>
+        <w:tabs>
+          <w:tab w:val="num" w:pos="5040"/>
+        </w:tabs>
+        <w:ind w:left="5040" w:hanging="360"/>
+      </w:pPr>
+      <w:rPr>
+        <w:rFonts w:ascii="Wingdings" w:hAnsi="Wingdings" w:hint="default"/>
+        <w:sz w:val="20"/>
+      </w:rPr>
+    </w:lvl>
+    <w:lvl w:ilvl="7" w:tentative="1">
+      <w:start w:val="1"/>
+      <w:numFmt w:val="bullet"/>
+      <w:lvlText w:val=""/>
+      <w:lvlJc w:val="left"/>
+      <w:pPr>
+        <w:tabs>
+          <w:tab w:val="num" w:pos="5760"/>
+        </w:tabs>
+        <w:ind w:left="5760" w:hanging="360"/>
+      </w:pPr>
+      <w:rPr>
+        <w:rFonts w:ascii="Wingdings" w:hAnsi="Wingdings" w:hint="default"/>
+        <w:sz w:val="20"/>
+      </w:rPr>
+    </w:lvl>
+    <w:lvl w:ilvl="8" w:tentative="1">
+      <w:start w:val="1"/>
+      <w:numFmt w:val="bullet"/>
+      <w:lvlText w:val=""/>
+      <w:lvlJc w:val="left"/>
+      <w:pPr>
+        <w:tabs>
+          <w:tab w:val="num" w:pos="6480"/>
+        </w:tabs>
+        <w:ind w:left="6480" w:hanging="360"/>
+      </w:pPr>
+      <w:rPr>
+        <w:rFonts w:ascii="Wingdings" w:hAnsi="Wingdings" w:hint="default"/>
+        <w:sz w:val="20"/>
+      </w:rPr>
+    </w:lvl>
+  </w:abstractNum>
+  <w:abstractNum w:abstractNumId="1" w15:restartNumberingAfterBreak="0">
+    <w:nsid w:val="1971331D"/>
+    <w:multiLevelType w:val="multilevel"/>
+    <w:tmpl w:val="1902DD74"/>
+    <w:lvl w:ilvl="0">
+      <w:start w:val="1"/>
+      <w:numFmt w:val="bullet"/>
+      <w:lvlText w:val=""/>
+      <w:lvlJc w:val="left"/>
+      <w:pPr>
+        <w:tabs>
+          <w:tab w:val="num" w:pos="720"/>
+        </w:tabs>
+        <w:ind w:left="720" w:hanging="360"/>
+      </w:pPr>
+      <w:rPr>
+        <w:rFonts w:ascii="Symbol" w:hAnsi="Symbol" w:hint="default"/>
+        <w:sz w:val="20"/>
+      </w:rPr>
+    </w:lvl>
+    <w:lvl w:ilvl="1" w:tentative="1">
+      <w:start w:val="1"/>
+      <w:numFmt w:val="bullet"/>
+      <w:lvlText w:val="o"/>
+      <w:lvlJc w:val="left"/>
+      <w:pPr>
+        <w:tabs>
+          <w:tab w:val="num" w:pos="1440"/>
+        </w:tabs>
+        <w:ind w:left="1440" w:hanging="360"/>
+      </w:pPr>
+      <w:rPr>
+        <w:rFonts w:ascii="Courier New" w:hAnsi="Courier New" w:hint="default"/>
+        <w:sz w:val="20"/>
+      </w:rPr>
+    </w:lvl>
+    <w:lvl w:ilvl="2" w:tentative="1">
+      <w:start w:val="1"/>
+      <w:numFmt w:val="bullet"/>
+      <w:lvlText w:val=""/>
+      <w:lvlJc w:val="left"/>
+      <w:pPr>
+        <w:tabs>
+          <w:tab w:val="num" w:pos="2160"/>
+        </w:tabs>
+        <w:ind w:left="2160" w:hanging="360"/>
+      </w:pPr>
+      <w:rPr>
+        <w:rFonts w:ascii="Wingdings" w:hAnsi="Wingdings" w:hint="default"/>
+        <w:sz w:val="20"/>
+      </w:rPr>
+    </w:lvl>
+    <w:lvl w:ilvl="3" w:tentative="1">
+      <w:start w:val="1"/>
+      <w:numFmt w:val="bullet"/>
+      <w:lvlText w:val=""/>
+      <w:lvlJc w:val="left"/>
+      <w:pPr>
+        <w:tabs>
+          <w:tab w:val="num" w:pos="2880"/>
+        </w:tabs>
+        <w:ind w:left="2880" w:hanging="360"/>
+      </w:pPr>
+      <w:rPr>
+        <w:rFonts w:ascii="Wingdings" w:hAnsi="Wingdings" w:hint="default"/>
+        <w:sz w:val="20"/>
+      </w:rPr>
+    </w:lvl>
+    <w:lvl w:ilvl="4" w:tentative="1">
+      <w:start w:val="1"/>
+      <w:numFmt w:val="bullet"/>
+      <w:lvlText w:val=""/>
+      <w:lvlJc w:val="left"/>
+      <w:pPr>
+        <w:tabs>
+          <w:tab w:val="num" w:pos="3600"/>
+        </w:tabs>
+        <w:ind w:left="3600" w:hanging="360"/>
+      </w:pPr>
+      <w:rPr>
+        <w:rFonts w:ascii="Wingdings" w:hAnsi="Wingdings" w:hint="default"/>
+        <w:sz w:val="20"/>
+      </w:rPr>
+    </w:lvl>
+    <w:lvl w:ilvl="5" w:tentative="1">
+      <w:start w:val="1"/>
+      <w:numFmt w:val="bullet"/>
+      <w:lvlText w:val=""/>
+      <w:lvlJc w:val="left"/>
+      <w:pPr>
+        <w:tabs>
+          <w:tab w:val="num" w:pos="4320"/>
+        </w:tabs>
+        <w:ind w:left="4320" w:hanging="360"/>
+      </w:pPr>
+      <w:rPr>
+        <w:rFonts w:ascii="Wingdings" w:hAnsi="Wingdings" w:hint="default"/>
+        <w:sz w:val="20"/>
+      </w:rPr>
+    </w:lvl>
+    <w:lvl w:ilvl="6" w:tentative="1">
+      <w:start w:val="1"/>
+      <w:numFmt w:val="bullet"/>
+      <w:lvlText w:val=""/>
+      <w:lvlJc w:val="left"/>
+      <w:pPr>
+        <w:tabs>
+          <w:tab w:val="num" w:pos="5040"/>
+        </w:tabs>
+        <w:ind w:left="5040" w:hanging="360"/>
+      </w:pPr>
+      <w:rPr>
+        <w:rFonts w:ascii="Wingdings" w:hAnsi="Wingdings" w:hint="default"/>
+        <w:sz w:val="20"/>
+      </w:rPr>
+    </w:lvl>
+    <w:lvl w:ilvl="7" w:tentative="1">
+      <w:start w:val="1"/>
+      <w:numFmt w:val="bullet"/>
+      <w:lvlText w:val=""/>
+      <w:lvlJc w:val="left"/>
+      <w:pPr>
+        <w:tabs>
+          <w:tab w:val="num" w:pos="5760"/>
+        </w:tabs>
+        <w:ind w:left="5760" w:hanging="360"/>
+      </w:pPr>
+      <w:rPr>
+        <w:rFonts w:ascii="Wingdings" w:hAnsi="Wingdings" w:hint="default"/>
+        <w:sz w:val="20"/>
+      </w:rPr>
+    </w:lvl>
+    <w:lvl w:ilvl="8" w:tentative="1">
+      <w:start w:val="1"/>
+      <w:numFmt w:val="bullet"/>
+      <w:lvlText w:val=""/>
+      <w:lvlJc w:val="left"/>
+      <w:pPr>
+        <w:tabs>
+          <w:tab w:val="num" w:pos="6480"/>
+        </w:tabs>
+        <w:ind w:left="6480" w:hanging="360"/>
+      </w:pPr>
+      <w:rPr>
+        <w:rFonts w:ascii="Wingdings" w:hAnsi="Wingdings" w:hint="default"/>
+        <w:sz w:val="20"/>
+      </w:rPr>
+    </w:lvl>
+  </w:abstractNum>
+  <w:abstractNum w:abstractNumId="2" w15:restartNumberingAfterBreak="0">
+    <w:nsid w:val="4DDA5C9C"/>
+    <w:multiLevelType w:val="multilevel"/>
+    <w:tmpl w:val="280812A0"/>
+    <w:lvl w:ilvl="0">
+      <w:start w:val="1"/>
+      <w:numFmt w:val="bullet"/>
+      <w:lvlText w:val=""/>
+      <w:lvlJc w:val="left"/>
+      <w:pPr>
+        <w:tabs>
+          <w:tab w:val="num" w:pos="720"/>
+        </w:tabs>
+        <w:ind w:left="720" w:hanging="360"/>
+      </w:pPr>
+      <w:rPr>
+        <w:rFonts w:ascii="Symbol" w:hAnsi="Symbol" w:hint="default"/>
+        <w:sz w:val="20"/>
+      </w:rPr>
+    </w:lvl>
+    <w:lvl w:ilvl="1" w:tentative="1">
+      <w:start w:val="1"/>
+      <w:numFmt w:val="bullet"/>
+      <w:lvlText w:val="o"/>
+      <w:lvlJc w:val="left"/>
+      <w:pPr>
+        <w:tabs>
+          <w:tab w:val="num" w:pos="1440"/>
+        </w:tabs>
+        <w:ind w:left="1440" w:hanging="360"/>
+      </w:pPr>
+      <w:rPr>
+        <w:rFonts w:ascii="Courier New" w:hAnsi="Courier New" w:hint="default"/>
+        <w:sz w:val="20"/>
+      </w:rPr>
+    </w:lvl>
+    <w:lvl w:ilvl="2" w:tentative="1">
+      <w:start w:val="1"/>
+      <w:numFmt w:val="bullet"/>
+      <w:lvlText w:val=""/>
+      <w:lvlJc w:val="left"/>
+      <w:pPr>
+        <w:tabs>
+          <w:tab w:val="num" w:pos="2160"/>
+        </w:tabs>
+        <w:ind w:left="2160" w:hanging="360"/>
+      </w:pPr>
+      <w:rPr>
+        <w:rFonts w:ascii="Wingdings" w:hAnsi="Wingdings" w:hint="default"/>
+        <w:sz w:val="20"/>
+      </w:rPr>
+    </w:lvl>
+    <w:lvl w:ilvl="3" w:tentative="1">
+      <w:start w:val="1"/>
+      <w:numFmt w:val="bullet"/>
+      <w:lvlText w:val=""/>
+      <w:lvlJc w:val="left"/>
+      <w:pPr>
+        <w:tabs>
+          <w:tab w:val="num" w:pos="2880"/>
+        </w:tabs>
+        <w:ind w:left="2880" w:hanging="360"/>
+      </w:pPr>
+      <w:rPr>
+        <w:rFonts w:ascii="Wingdings" w:hAnsi="Wingdings" w:hint="default"/>
+        <w:sz w:val="20"/>
+      </w:rPr>
+    </w:lvl>
+    <w:lvl w:ilvl="4" w:tentative="1">
+      <w:start w:val="1"/>
+      <w:numFmt w:val="bullet"/>
+      <w:lvlText w:val=""/>
+      <w:lvlJc w:val="left"/>
+      <w:pPr>
+        <w:tabs>
+          <w:tab w:val="num" w:pos="3600"/>
+        </w:tabs>
+        <w:ind w:left="3600" w:hanging="360"/>
+      </w:pPr>
+      <w:rPr>
+        <w:rFonts w:ascii="Wingdings" w:hAnsi="Wingdings" w:hint="default"/>
+        <w:sz w:val="20"/>
+      </w:rPr>
+    </w:lvl>
+    <w:lvl w:ilvl="5" w:tentative="1">
+      <w:start w:val="1"/>
+      <w:numFmt w:val="bullet"/>
+      <w:lvlText w:val=""/>
+      <w:lvlJc w:val="left"/>
+      <w:pPr>
+        <w:tabs>
+          <w:tab w:val="num" w:pos="4320"/>
+        </w:tabs>
+        <w:ind w:left="4320" w:hanging="360"/>
+      </w:pPr>
+      <w:rPr>
+        <w:rFonts w:ascii="Wingdings" w:hAnsi="Wingdings" w:hint="default"/>
+        <w:sz w:val="20"/>
+      </w:rPr>
+    </w:lvl>
+    <w:lvl w:ilvl="6" w:tentative="1">
+      <w:start w:val="1"/>
+      <w:numFmt w:val="bullet"/>
+      <w:lvlText w:val=""/>
+      <w:lvlJc w:val="left"/>
+      <w:pPr>
+        <w:tabs>
+          <w:tab w:val="num" w:pos="5040"/>
+        </w:tabs>
+        <w:ind w:left="5040" w:hanging="360"/>
+      </w:pPr>
+      <w:rPr>
+        <w:rFonts w:ascii="Wingdings" w:hAnsi="Wingdings" w:hint="default"/>
+        <w:sz w:val="20"/>
+      </w:rPr>
+    </w:lvl>
+    <w:lvl w:ilvl="7" w:tentative="1">
+      <w:start w:val="1"/>
+      <w:numFmt w:val="bullet"/>
+      <w:lvlText w:val=""/>
+      <w:lvlJc w:val="left"/>
+      <w:pPr>
+        <w:tabs>
+          <w:tab w:val="num" w:pos="5760"/>
+        </w:tabs>
+        <w:ind w:left="5760" w:hanging="360"/>
+      </w:pPr>
+      <w:rPr>
+        <w:rFonts w:ascii="Wingdings" w:hAnsi="Wingdings" w:hint="default"/>
+        <w:sz w:val="20"/>
+      </w:rPr>
+    </w:lvl>
+    <w:lvl w:ilvl="8" w:tentative="1">
+      <w:start w:val="1"/>
+      <w:numFmt w:val="bullet"/>
+      <w:lvlText w:val=""/>
+      <w:lvlJc w:val="left"/>
+      <w:pPr>
+        <w:tabs>
+          <w:tab w:val="num" w:pos="6480"/>
+        </w:tabs>
+        <w:ind w:left="6480" w:hanging="360"/>
+      </w:pPr>
+      <w:rPr>
+        <w:rFonts w:ascii="Wingdings" w:hAnsi="Wingdings" w:hint="default"/>
+        <w:sz w:val="20"/>
+      </w:rPr>
+    </w:lvl>
+  </w:abstractNum>
+  <w:abstractNum w:abstractNumId="3" w15:restartNumberingAfterBreak="0">
+    <w:nsid w:val="4F7D32D5"/>
+    <w:multiLevelType w:val="multilevel"/>
+    <w:tmpl w:val="CA129F62"/>
+    <w:lvl w:ilvl="0">
+      <w:start w:val="1"/>
+      <w:numFmt w:val="bullet"/>
+      <w:lvlText w:val=""/>
+      <w:lvlJc w:val="left"/>
+      <w:pPr>
+        <w:tabs>
+          <w:tab w:val="num" w:pos="720"/>
+        </w:tabs>
+        <w:ind w:left="720" w:hanging="360"/>
+      </w:pPr>
+      <w:rPr>
+        <w:rFonts w:ascii="Symbol" w:hAnsi="Symbol" w:hint="default"/>
+        <w:sz w:val="20"/>
+      </w:rPr>
+    </w:lvl>
+    <w:lvl w:ilvl="1" w:tentative="1">
+      <w:start w:val="1"/>
+      <w:numFmt w:val="bullet"/>
+      <w:lvlText w:val="o"/>
+      <w:lvlJc w:val="left"/>
+      <w:pPr>
+        <w:tabs>
+          <w:tab w:val="num" w:pos="1440"/>
+        </w:tabs>
+        <w:ind w:left="1440" w:hanging="360"/>
+      </w:pPr>
+      <w:rPr>
+        <w:rFonts w:ascii="Courier New" w:hAnsi="Courier New" w:hint="default"/>
+        <w:sz w:val="20"/>
+      </w:rPr>
+    </w:lvl>
+    <w:lvl w:ilvl="2" w:tentative="1">
+      <w:start w:val="1"/>
+      <w:numFmt w:val="bullet"/>
+      <w:lvlText w:val=""/>
+      <w:lvlJc w:val="left"/>
+      <w:pPr>
+        <w:tabs>
+          <w:tab w:val="num" w:pos="2160"/>
+        </w:tabs>
+        <w:ind w:left="2160" w:hanging="360"/>
+      </w:pPr>
+      <w:rPr>
+        <w:rFonts w:ascii="Wingdings" w:hAnsi="Wingdings" w:hint="default"/>
+        <w:sz w:val="20"/>
+      </w:rPr>
+    </w:lvl>
+    <w:lvl w:ilvl="3" w:tentative="1">
+      <w:start w:val="1"/>
+      <w:numFmt w:val="bullet"/>
+      <w:lvlText w:val=""/>
+      <w:lvlJc w:val="left"/>
+      <w:pPr>
+        <w:tabs>
+          <w:tab w:val="num" w:pos="2880"/>
+        </w:tabs>
+        <w:ind w:left="2880" w:hanging="360"/>
+      </w:pPr>
+      <w:rPr>
+        <w:rFonts w:ascii="Wingdings" w:hAnsi="Wingdings" w:hint="default"/>
+        <w:sz w:val="20"/>
+      </w:rPr>
+    </w:lvl>
+    <w:lvl w:ilvl="4" w:tentative="1">
+      <w:start w:val="1"/>
+      <w:numFmt w:val="bullet"/>
+      <w:lvlText w:val=""/>
+      <w:lvlJc w:val="left"/>
+      <w:pPr>
+        <w:tabs>
+          <w:tab w:val="num" w:pos="3600"/>
+        </w:tabs>
+        <w:ind w:left="3600" w:hanging="360"/>
+      </w:pPr>
+      <w:rPr>
+        <w:rFonts w:ascii="Wingdings" w:hAnsi="Wingdings" w:hint="default"/>
+        <w:sz w:val="20"/>
+      </w:rPr>
+    </w:lvl>
+    <w:lvl w:ilvl="5" w:tentative="1">
+      <w:start w:val="1"/>
+      <w:numFmt w:val="bullet"/>
+      <w:lvlText w:val=""/>
+      <w:lvlJc w:val="left"/>
+      <w:pPr>
+        <w:tabs>
+          <w:tab w:val="num" w:pos="4320"/>
+        </w:tabs>
+        <w:ind w:left="4320" w:hanging="360"/>
+      </w:pPr>
+      <w:rPr>
+        <w:rFonts w:ascii="Wingdings" w:hAnsi="Wingdings" w:hint="default"/>
+        <w:sz w:val="20"/>
+      </w:rPr>
+    </w:lvl>
+    <w:lvl w:ilvl="6" w:tentative="1">
+      <w:start w:val="1"/>
+      <w:numFmt w:val="bullet"/>
+      <w:lvlText w:val=""/>
+      <w:lvlJc w:val="left"/>
+      <w:pPr>
+        <w:tabs>
+          <w:tab w:val="num" w:pos="5040"/>
+        </w:tabs>
+        <w:ind w:left="5040" w:hanging="360"/>
+      </w:pPr>
+      <w:rPr>
+        <w:rFonts w:ascii="Wingdings" w:hAnsi="Wingdings" w:hint="default"/>
+        <w:sz w:val="20"/>
+      </w:rPr>
+    </w:lvl>
+    <w:lvl w:ilvl="7" w:tentative="1">
+      <w:start w:val="1"/>
+      <w:numFmt w:val="bullet"/>
+      <w:lvlText w:val=""/>
+      <w:lvlJc w:val="left"/>
+      <w:pPr>
+        <w:tabs>
+          <w:tab w:val="num" w:pos="5760"/>
+        </w:tabs>
+        <w:ind w:left="5760" w:hanging="360"/>
+      </w:pPr>
+      <w:rPr>
+        <w:rFonts w:ascii="Wingdings" w:hAnsi="Wingdings" w:hint="default"/>
+        <w:sz w:val="20"/>
+      </w:rPr>
+    </w:lvl>
+    <w:lvl w:ilvl="8" w:tentative="1">
+      <w:start w:val="1"/>
+      <w:numFmt w:val="bullet"/>
+      <w:lvlText w:val=""/>
+      <w:lvlJc w:val="left"/>
+      <w:pPr>
+        <w:tabs>
+          <w:tab w:val="num" w:pos="6480"/>
+        </w:tabs>
+        <w:ind w:left="6480" w:hanging="360"/>
+      </w:pPr>
+      <w:rPr>
+        <w:rFonts w:ascii="Wingdings" w:hAnsi="Wingdings" w:hint="default"/>
+        <w:sz w:val="20"/>
+      </w:rPr>
+    </w:lvl>
+  </w:abstractNum>
+  <w:abstractNum w:abstractNumId="4" w15:restartNumberingAfterBreak="0">
     <w:nsid w:val="74A24BAA"/>
     <w:multiLevelType w:val="hybridMultilevel"/>
     <w:tmpl w:val="D29C339E"/>
@@ -1350,10 +2158,22 @@
     </w:lvl>
   </w:abstractNum>
   <w:num w:numId="1" w16cid:durableId="196742382">
-    <w:abstractNumId w:val="0"/>
+    <w:abstractNumId w:val="4"/>
     <w:lvlOverride w:ilvl="0">
       <w:startOverride w:val="1"/>
     </w:lvlOverride>
+  </w:num>
+  <w:num w:numId="2" w16cid:durableId="341056024">
+    <w:abstractNumId w:val="0"/>
+  </w:num>
+  <w:num w:numId="3" w16cid:durableId="1883396517">
+    <w:abstractNumId w:val="3"/>
+  </w:num>
+  <w:num w:numId="4" w16cid:durableId="87626389">
+    <w:abstractNumId w:val="2"/>
+  </w:num>
+  <w:num w:numId="5" w16cid:durableId="646789602">
+    <w:abstractNumId w:val="1"/>
   </w:num>
 </w:numbering>
 </file>
@@ -1838,7 +2658,6 @@
   <w:style w:type="character" w:default="1" w:styleId="DefaultParagraphFont">
     <w:name w:val="Default Paragraph Font"/>
     <w:uiPriority w:val="1"/>
-    <w:semiHidden/>
     <w:unhideWhenUsed/>
   </w:style>
   <w:style w:type="table" w:default="1" w:styleId="TableNormal">
@@ -2039,12 +2858,33 @@
 
 <file path=word/glossary/fontTable.xml><?xml version="1.0" encoding="utf-8"?>
 <w:fonts xmlns:mc="http://schemas.openxmlformats.org/markup-compatibility/2006" xmlns:r="http://schemas.openxmlformats.org/officeDocument/2006/relationships" xmlns:w="http://schemas.openxmlformats.org/wordprocessingml/2006/main" xmlns:w14="http://schemas.microsoft.com/office/word/2010/wordml" xmlns:w15="http://schemas.microsoft.com/office/word/2012/wordml" xmlns:w16cex="http://schemas.microsoft.com/office/word/2018/wordml/cex" xmlns:w16cid="http://schemas.microsoft.com/office/word/2016/wordml/cid" xmlns:w16="http://schemas.microsoft.com/office/word/2018/wordml" xmlns:w16du="http://schemas.microsoft.com/office/word/2023/wordml/word16du" xmlns:w16sdtdh="http://schemas.microsoft.com/office/word/2020/wordml/sdtdatahash" xmlns:w16sdtfl="http://schemas.microsoft.com/office/word/2024/wordml/sdtformatlock" xmlns:w16se="http://schemas.microsoft.com/office/word/2015/wordml/symex" mc:Ignorable="w14 w15 w16se w16cid w16 w16cex w16sdtdh w16sdtfl w16du">
+  <w:font w:name="Symbol">
+    <w:panose1 w:val="05050102010706020507"/>
+    <w:charset w:val="02"/>
+    <w:family w:val="roman"/>
+    <w:pitch w:val="variable"/>
+    <w:sig w:usb0="00000000" w:usb1="10000000" w:usb2="00000000" w:usb3="00000000" w:csb0="80000000" w:csb1="00000000"/>
+  </w:font>
   <w:font w:name="Times New Roman">
     <w:panose1 w:val="02020603050405020304"/>
     <w:charset w:val="00"/>
     <w:family w:val="roman"/>
     <w:pitch w:val="variable"/>
     <w:sig w:usb0="E0002EFF" w:usb1="C000785B" w:usb2="00000009" w:usb3="00000000" w:csb0="000001FF" w:csb1="00000000"/>
+  </w:font>
+  <w:font w:name="Courier New">
+    <w:panose1 w:val="02070309020205020404"/>
+    <w:charset w:val="00"/>
+    <w:family w:val="modern"/>
+    <w:pitch w:val="fixed"/>
+    <w:sig w:usb0="E0002EFF" w:usb1="C0007843" w:usb2="00000009" w:usb3="00000000" w:csb0="000001FF" w:csb1="00000000"/>
+  </w:font>
+  <w:font w:name="Wingdings">
+    <w:panose1 w:val="05000000000000000000"/>
+    <w:charset w:val="02"/>
+    <w:family w:val="auto"/>
+    <w:pitch w:val="variable"/>
+    <w:sig w:usb0="00000000" w:usb1="10000000" w:usb2="00000000" w:usb3="00000000" w:csb0="80000000" w:csb1="00000000"/>
   </w:font>
   <w:font w:name="Georgia">
     <w:panose1 w:val="02040502050405020303"/>
@@ -2084,10 +2924,12 @@
   </w:compat>
   <w:rsids>
     <w:rsidRoot w:val="00FC5C35"/>
+    <w:rsid w:val="001264B7"/>
     <w:rsid w:val="001E128A"/>
     <w:rsid w:val="003F3BBE"/>
     <w:rsid w:val="009F120F"/>
     <w:rsid w:val="00BF1EC2"/>
+    <w:rsid w:val="00C32501"/>
     <w:rsid w:val="00D53A01"/>
     <w:rsid w:val="00E207E2"/>
     <w:rsid w:val="00F55CA3"/>

</xml_diff>